<commit_message>
Update organisational contact number
</commit_message>
<xml_diff>
--- a/Governance Documents/ASCO Institutional Profile 2026.docx
+++ b/Governance Documents/ASCO Institutional Profile 2026.docx
@@ -850,7 +850,7 @@
           </w:tcPr>
           <w:p>
             <w:r>
-              <w:t>+27 78 287 2814</w:t>
+              <w:t>+27 76 757 5773</w:t>
             </w:r>
           </w:p>
         </w:tc>
@@ -7219,7 +7219,7 @@
                 <w:rFonts w:ascii="Arial" w:hAnsi="Arial"/>
                 <w:sz w:val="17"/>
               </w:rPr>
-              <w:t>+27 78 287 2814</w:t>
+              <w:t>+27 76 757 5773</w:t>
             </w:r>
           </w:p>
         </w:tc>

</xml_diff>